<commit_message>
#12 Regenera entregaveis da avaliacao 1
</commit_message>
<xml_diff>
--- a/target/avaliacao_01/relatorio_parcial_lucimar_oliveira_do_nascimento.docx
+++ b/target/avaliacao_01/relatorio_parcial_lucimar_oliveira_do_nascimento.docx
@@ -196,7 +196,7 @@
           <w:color w:val="000000"/>
           <w:sz w:val="24"/>
         </w:rPr>
-        <w:t xml:space="preserve"> Classificação de faixas de atraso na partida de voos com dados da ANAC</w:t>
+        <w:t xml:space="preserve">  Exploração de dados públicos da Agência Nacional de Aviação Civil (ANAC) para investigar e prever, com antecedência definida, atrasos e cancelamentos de voos regulares</w:t>
       </w:r>
     </w:p>
     <w:p>
@@ -219,7 +219,7 @@
           <w:color w:val="000000"/>
           <w:sz w:val="24"/>
         </w:rPr>
-        <w:t xml:space="preserve"> Francisco Fonseca; Lucimar Oliveira do Nascimento; Osvaldo Souza.</w:t>
+        <w:t xml:space="preserve"> Francisco Alberto Fonseca Neto; Lucimar Oliveira do Nascimento; Osvaldo Souza Menezes Júnior Menezes Júnior.</w:t>
       </w:r>
     </w:p>
     <w:p>
@@ -599,17 +599,6 @@
       </w:r>
     </w:p>
     <w:p>
-      <w:pPr/>
-      <w:r>
-        <w:rPr>
-          <w:rFonts w:ascii="Times New Roman" w:hAnsi="Times New Roman"/>
-          <w:color w:val="000000"/>
-          <w:sz w:val="24"/>
-        </w:rPr>
-        <w:t>Para a Atividade 2, prevê-se comparar classificadores com uma referência simples de classe majoritária, organizar treino, validação e teste em ordem temporal e avaliar o desempenho por classe. A seleção de algoritmos e de codificações categóricas será realizada nessa etapa, com base nos resultados de validação. Esta entrega parcial não apresenta modelos treinados nem conclusões sobre desempenho preditivo.</w:t>
-      </w:r>
-    </w:p>
-    <w:p>
       <w:pPr>
         <w:pStyle w:val="Ttulo1"/>
       </w:pPr>
@@ -630,7 +619,7 @@
           <w:color w:val="000000"/>
           <w:sz w:val="24"/>
         </w:rPr>
-        <w:t>Jannuzzi (2017) discute a construção e os usos de indicadores em diagnósticos e políticas públicas, ressaltando a relação entre conceitos, fontes e aplicações. Essa perspectiva orienta a necessidade de delimitar o que a medida utilizada representa. Neste projeto, a diferença entre horários de partida mede pontualidade registrada; ela não mede diretamente qualidade global do serviço nem impacto de uma política. A utilidade administrativa do diagnóstico depende da qualidade dos registros, da cobertura da base e da clareza das regras de cálculo.</w:t>
+        <w:t>A pontualidade constitui uma dimensão relevante para o estudo do transporte aéreo, mas sua interpretação depende da definição do indicador e da cobertura dos registros. Neste projeto, o atraso é definido como a diferença entre os horários real e previsto de partida. A medida descreve a pontualidade registrada, sem representar, isoladamente, a qualidade global do serviço ou o impacto de uma política pública.</w:t>
       </w:r>
     </w:p>
     <w:p>
@@ -641,7 +630,7 @@
           <w:color w:val="000000"/>
           <w:sz w:val="24"/>
         </w:rPr>
-        <w:t>Sternberg et al. (2017) revisam abordagens de previsão de atrasos de voos, organizando a literatura conforme escopo, dados e métodos computacionais. A variedade de formulações mostra por que é necessário especificar se o desfecho se refere à partida ou à chegada e quais informações estarão disponíveis no momento da previsão. O presente projeto adota a partida como desfecho. Associações descritivas entre hora programada e atraso poderão sugerir hipóteses; não demonstram propagação de atrasos entre etapas de uma aeronave, pois essa conclusão exigiria informações e desenho analítico adicionais.</w:t>
+        <w:t>Carvalho et al. (2021) apresentam uma revisão sistemática das aplicações de ciência de dados à investigação de atrasos de voos, organizando as abordagens e os métodos utilizados na área. A diversidade de problemas examinados oferece uma base para situar o presente trabalho e explicitar seu recorte: prever a faixa de atraso na partida de uma etapa de voo, utilizando informações disponíveis antes da partida. Assim, o estudo não se propõe a prever atrasos na chegada nem a identificar causas individuais de atrasos. A companhia aérea, os aeroportos de origem e destino, a rota e o horário programado serão examinados como possíveis preditores, cuja utilidade deverá ser verificada empiricamente na base VRA/ANAC de 2024 e 2025.</w:t>
       </w:r>
     </w:p>
     <w:p>
@@ -652,7 +641,7 @@
           <w:color w:val="000000"/>
           <w:sz w:val="24"/>
         </w:rPr>
-        <w:t>Izbicki e Santos (2020) apresentam os fundamentos estatísticos do aprendizado supervisionado e a distinção entre regressão e classificação. Ao transformar o atraso contínuo em faixas, este estudo formula um problema de classificação com ordem entre categorias. A escolha facilita a descrição por níveis, mas perde informação sobre a diferença exata em minutos dentro de cada faixa. Assim, a análise exploratória mantém também o atraso contínuo, enquanto a avaliação futura deverá considerar os erros entre classes e sua distância ordinal.</w:t>
+        <w:t>No contexto brasileiro, Sternberg et al. (2016) investigam padrões de atraso na partida de voos domésticos regulares por meio de regras de associação, relacionando características dos voos, aeroportos, companhias e condições meteorológicas. Esse trabalho oferece um antecedente para a análise exploratória proposta, em particular para comparar distribuições de atraso entre empresas, aeroportos e períodos do dia. Entretanto, a descoberta de associações não equivale à avaliação de um classificador supervisionado nem demonstra causalidade. Além disso, o recorte deste projeto inclui registros envolvendo empresas e aeroportos estrangeiros e não incorpora uma base meteorológica. Por isso, os padrões encontrados naquele estudo devem orientar perguntas de análise, sem serem assumidos como resultados válidos para a base atual. Associações entre horário programado e atraso também não bastam para demonstrar propagação entre etapas de uma mesma aeronave.</w:t>
       </w:r>
     </w:p>
     <w:p>
@@ -663,7 +652,7 @@
           <w:color w:val="000000"/>
           <w:sz w:val="24"/>
         </w:rPr>
-        <w:t>Hastie, Tibshirani e Friedman (2009) discutem aprendizagem estatística, complexidade de modelos e avaliação da capacidade de generalização. Para este projeto, isso motiva separar a construção do modelo de sua avaliação em observações futuras. O uso de datas reais de partida e chegada, do atraso calculado ou de qualquer representação do próprio alvo como preditor permitiria acessar informação posterior ao momento de previsão. Essas variáveis devem ser excluídas da matriz de preditores. Transformações que aprendam parâmetros, incluindo imputação e codificação, deverão ser ajustadas apenas nos dados de treinamento.</w:t>
+        <w:t>A partir do atraso contínuo, este estudo define seis faixas ordenadas e formula uma tarefa de classificação. Essa opção facilita a descrição por níveis, mas perde informação sobre a diferença exata em minutos dentro de cada categoria. As seis faixas e seus limites são escolhas analíticas do projeto, e não categorias regulatórias ou uma classificação validada pelos artigos citados. A análise exploratória preserva, portanto, o atraso contínuo, enquanto a avaliação futura deverá considerar tanto a classe prevista quanto a distância entre a faixa prevista e a observada.</w:t>
       </w:r>
     </w:p>
     <w:p>
@@ -674,7 +663,7 @@
           <w:color w:val="000000"/>
           <w:sz w:val="24"/>
         </w:rPr>
-        <w:t>He e Garcia (2009) revisam o aprendizado com classes desbalanceadas e mostram que a distribuição desigual das classes exige atenção na aprendizagem e na avaliação. Na execução original da base deste projeto, a faixa pontual ou antecipada representou 59,38% dos registros elegíveis, enquanto a faixa de mais de 45 até 60 minutos correspondeu a 1,74%. Essa diferença justifica avaliar cada faixa e comparar métricas com pesos iguais entre classes, como macro-F1 e acurácia balanceada, além da matriz de confusão. Ponderação de classes ou reamostragem são alternativas a testar no treinamento; não constituem garantia de melhora.</w:t>
+        <w:t>Moreira et al. (2018) aproximam a discussão metodológica do domínio estudado ao avaliar técnicas de pré-processamento e classificação de atrasos com dados de operações aéreas brasileiras integrados a informações meteorológicas. Os autores investigam o desbalanceamento entre presença e ausência de atraso e a capacidade dos modelos de reconhecer a ocorrência de atrasos. Na execução original da base deste projeto, a faixa pontual ou antecipada representou 59,38% dos registros elegíveis, enquanto a faixa de mais de 45 até 60 minutos correspondeu a 1,74%. A diferença motiva avaliar o desempenho de cada faixa, utilizando matriz de confusão, macro-F1 e acurácia balanceada, além da acurácia global. Como Moreira et al. (2018) estudam uma classificação binária e utilizam informações adicionais, seus resultados não constituem uma expectativa de desempenho para as seis classes deste projeto. Ponderação de classes ou reamostragem serão alternativas a testar apenas nos dados de treinamento, sem pressupor melhora.</w:t>
       </w:r>
     </w:p>
     <w:p>
@@ -685,7 +674,29 @@
           <w:color w:val="000000"/>
           <w:sz w:val="24"/>
         </w:rPr>
-        <w:t>Em conjunto, essas contribuições orientam um estudo de caráter preditivo e exploratório. As estatísticas observadas descrevem os registros selecionados, sem estabelecer causalidade. Os extremos de atraso encontrados na execução demandam investigação e não devem ser atribuídos automaticamente a condições meteorológicas ou manutenção. Os metadados oficiais do VRA informam que os horários previstos e realizados são publicados em horário de Brasília; ainda assim, a consolidação e as diferenças temporais devem ser auditadas. A etapa seguinte dependerá dessas verificações e da avaliação temporal, preservando a rastreabilidade da base de entrada.</w:t>
+        <w:t>A dimensão temporal também merece atenção. Giusti et al. (2022) investigam a previsão de atrasos sob mudanças na distribuição dos dados ao longo do tempo, fenômeno conhecido como concept drift, e analisam estratégias de atualização de modelos em diferentes escalas. Para o presente trabalho, essa discussão reforça a necessidade de avaliar a capacidade de prever observações posteriores às utilizadas no treinamento. A separação temporal prevista para a etapa de modelagem permitirá examinar a generalização no período reservado para teste; ela não demonstra, por si só, a ocorrência de concept drift entre 2024 e 2025. Diferenças entre períodos e eventual deterioração do desempenho deverão ser discutidas à luz da composição dos voos e da qualidade dos registros, sem atribuição automática a mudanças no processo operacional.</w:t>
+      </w:r>
+    </w:p>
+    <w:p>
+      <w:pPr/>
+      <w:r>
+        <w:rPr>
+          <w:rFonts w:ascii="Times New Roman" w:hAnsi="Times New Roman"/>
+          <w:color w:val="000000"/>
+          <w:sz w:val="24"/>
+        </w:rPr>
+        <w:t>Como o objetivo é antecipar a faixa de atraso, a matriz de preditores deverá excluir as datas reais de partida e chegada, o atraso calculado e qualquer representação do próprio alvo, pois essas informações não estariam disponíveis no momento da previsão. Transformações que aprendam parâmetros, como imputação e codificação, deverão ser ajustadas apenas no treinamento. Esses cuidados permitem que a avaliação temporal represente de forma mais coerente o uso pretendido do modelo.</w:t>
+      </w:r>
+    </w:p>
+    <w:p>
+      <w:pPr/>
+      <w:r>
+        <w:rPr>
+          <w:rFonts w:ascii="Times New Roman" w:hAnsi="Times New Roman"/>
+          <w:color w:val="000000"/>
+          <w:sz w:val="24"/>
+        </w:rPr>
+        <w:t>Em conjunto, a literatura sustenta a relevância do tema e orienta a análise de padrões, o tratamento do desbalanceamento e a avaliação temporal. Nesta etapa parcial, o trabalho descreve a base e suas limitações; a capacidade preditiva será examinada na etapa seguinte. Cancelamentos e registros sem elementos para calcular o alvo serão contabilizados na auditoria de exclusões. Os extremos de atraso demandam inspeção dos registros e da origem das datas, sem atribuição automática a meteorologia ou manutenção. Os metadados oficiais do VRA informam que os horários previstos e realizados são publicados em horário de Brasília (ANAC, s.d.); ainda assim, a consolidação e as diferenças temporais devem ser auditadas, preservando a rastreabilidade da base de entrada.</w:t>
       </w:r>
     </w:p>
     <w:p>
@@ -728,7 +739,7 @@
           <w:color w:val="000000"/>
           <w:sz w:val="24"/>
         </w:rPr>
-        <w:t>HASTIE, Trevor; TIBSHIRANI, Robert; FRIEDMAN, Jerome. The elements of statistical learning: data mining, inference, and prediction. 2. ed. New York: Springer, 2009. DOI: https://doi.org/10.1007/978-0-387-84858-7.</w:t>
+        <w:t>CARVALHO, Leonardo et al. On the relevance of data science for flight delay research: a systematic review. Transport Reviews, v. 41, n. 4, p. 499–528, 2021. DOI: https://doi.org/10.1080/01441647.2020.1861123.</w:t>
       </w:r>
     </w:p>
     <w:p>
@@ -743,7 +754,7 @@
           <w:color w:val="000000"/>
           <w:sz w:val="24"/>
         </w:rPr>
-        <w:t>HE, Haibo; GARCIA, Edwardo A. Learning from imbalanced data. IEEE Transactions on Knowledge and Data Engineering, v. 21, n. 9, p. 1263–1284, 2009. DOI: https://doi.org/10.1109/TKDE.2008.239.</w:t>
+        <w:t>GIUSTI, Lucas et al. Analyzing flight delay prediction under concept drift. Evolving Systems, v. 13, n. 5, p. 723–736, 2022. DOI: https://doi.org/10.1007/s12530-021-09415-z.</w:t>
       </w:r>
     </w:p>
     <w:p>
@@ -758,7 +769,7 @@
           <w:color w:val="000000"/>
           <w:sz w:val="24"/>
         </w:rPr>
-        <w:t>IZBICKI, Rafael; SANTOS, Tiago Mendonça dos. Aprendizado de máquina: uma abordagem estatística. 1. ed. [S. l.]: Rafael Izbicki, 2020. Disponível em: https://rafaelizbicki.com/ame/. Acesso em: 27 set. 2026.</w:t>
+        <w:t>MOREIRA, Leonardo; DANTAS, Christofer; OLIVEIRA, Leonardo; SOARES, Jorge; OGASAWARA, Eduardo. On Evaluating Data Preprocessing Methods for Machine Learning Models for Flight Delays. In: INTERNATIONAL JOINT CONFERENCE ON NEURAL NETWORKS (IJCNN), 2018, Rio de Janeiro. Proceedings [...]. IEEE, 2018. p. 1–8. DOI: https://doi.org/10.1109/IJCNN.2018.8489294.</w:t>
       </w:r>
     </w:p>
     <w:p>
@@ -773,22 +784,7 @@
           <w:color w:val="000000"/>
           <w:sz w:val="24"/>
         </w:rPr>
-        <w:t>JANNUZZI, Paulo de Martino. Indicadores sociais no Brasil: conceitos, fontes de dados e aplicações. 6. ed. rev. e ampl. Campinas: Alínea, 2017.</w:t>
-      </w:r>
-    </w:p>
-    <w:p>
-      <w:pPr>
-        <w:spacing w:line="240" w:lineRule="auto" w:after="120"/>
-        <w:ind w:left="576" w:hanging="576"/>
-        <w:jc w:val="left"/>
-      </w:pPr>
-      <w:r>
-        <w:rPr>
-          <w:rFonts w:ascii="Times New Roman" w:hAnsi="Times New Roman"/>
-          <w:color w:val="000000"/>
-          <w:sz w:val="24"/>
-        </w:rPr>
-        <w:t>STERNBERG, Alice; SOARES, Jorge; CARVALHO, Diego; OGASAWARA, Eduardo. A review on flight delay prediction. arXiv, 2017. Preprint, versão 1, arXiv:1703.06118v1. Disponível em: https://arxiv.org/abs/1703.06118v1. Acesso em: 27 set. 2026.</w:t>
+        <w:t>STERNBERG, Alice; CARVALHO, Diego; MURTA, Leonardo; SOARES, Jorge; OGASAWARA, Eduardo. An analysis of Brazilian flight delays based on frequent patterns. Transportation Research Part E: Logistics and Transportation Review, v. 95, p. 282–298, 2016. DOI: https://doi.org/10.1016/j.tre.2016.09.013.</w:t>
       </w:r>
     </w:p>
     <w:sectPr>

</xml_diff>